<commit_message>
Add Russian function documentation
</commit_message>
<xml_diff>
--- a/Detailed_Code_Explanation_RU.docx
+++ b/Detailed_Code_Explanation_RU.docx
@@ -1254,6 +1254,990 @@
           <w:rFonts w:ascii="Times New Roman" w:hAnsi="Times New Roman" w:eastAsia="Times New Roman" w:cs="Times New Roman"/>
         </w:rPr>
         <w:t>Именно поэтому для полного понимания программы важно смотреть не только на одну функцию, а на всю цепочку: MainViewModel.StartServerAsync -&gt; HttpMonitorServer.StartAsync -&gt; AcceptLoopAsync -&gt; HandleRequestAsync для входящих подключений и MainViewModel.SendRequestAsync -&gt; ClientRequestService.SendAsync для исходящих. В сумме эти участки и составляют основную логику HttpMonitorApp.</w:t>
+      </w:r>
+    </w:p>
+    <w:p>
+      <w:r>
+        <w:br w:type="page"/>
+      </w:r>
+    </w:p>
+    <w:p>
+      <w:pPr>
+        <w:pStyle w:val="Heading1"/>
+      </w:pPr>
+      <w:r>
+        <w:rPr>
+          <w:rFonts w:ascii="Times New Roman" w:hAnsi="Times New Roman" w:eastAsia="Times New Roman"/>
+        </w:rPr>
+        <w:t>?????? ?????????? ??????? ????????? ? ???????? ??????</w:t>
+      </w:r>
+    </w:p>
+    <w:p>
+      <w:pPr>
+        <w:spacing w:after="120"/>
+        <w:ind w:firstLine="360"/>
+      </w:pPr>
+      <w:r>
+        <w:t>????????? HttpMonitorApp ? ??? WPF-?????????? ??? ??????????? HTTP-????????. ??? ?????????? ????????? HTTP-??????, ?????????? HTTP-??????, ?????????????? ???????? ? ???????, ???? ?????????? ? ??????????? ???????? ?? ????????? ??????????.</w:t>
+      </w:r>
+    </w:p>
+    <w:p>
+      <w:pPr>
+        <w:spacing w:after="120"/>
+        <w:ind w:firstLine="360"/>
+      </w:pPr>
+      <w:r>
+        <w:t>???????? ???????????: ?????? ?????????? ??????? ?? ????????? ?????, ????????? GET ? POST ????????, ???????? ?????????? GET/POST ???????? ?? ????? URL, ?????? ????? ? ???? logs.txt, ?????????? ????? ?? ?????? ? ???????, ??????????? ??????? ?????????? ? ??????? ????????.</w:t>
+      </w:r>
+    </w:p>
+    <w:p>
+      <w:pPr>
+        <w:pStyle w:val="Heading2"/>
+      </w:pPr>
+      <w:r>
+        <w:rPr>
+          <w:rFonts w:ascii="Times New Roman" w:hAnsi="Times New Roman" w:eastAsia="Times New Roman"/>
+        </w:rPr>
+        <w:t>????????? ???????</w:t>
+      </w:r>
+    </w:p>
+    <w:p>
+      <w:pPr>
+        <w:pStyle w:val="ListBullet"/>
+        <w:spacing w:after="60"/>
+      </w:pPr>
+      <w:r>
+        <w:t>HttpMonitorApp/MainWindow.xaml ? ?????????? ???????? ???????? ????: ???? ???????, HTTP-??????, ??????????, ?????? ? ????.</w:t>
+      </w:r>
+    </w:p>
+    <w:p>
+      <w:pPr>
+        <w:pStyle w:val="ListBullet"/>
+        <w:spacing w:after="60"/>
+      </w:pPr>
+      <w:r>
+        <w:t>HttpMonitorApp/MainWindow.xaml.cs ? ????????? ???? ? MainViewModel ? ????????? ????????????? ?????? ??? ???????? ??????????.</w:t>
+      </w:r>
+    </w:p>
+    <w:p>
+      <w:pPr>
+        <w:pStyle w:val="ListBullet"/>
+        <w:spacing w:after="60"/>
+      </w:pPr>
+      <w:r>
+        <w:t>HttpMonitorApp/ViewModels/MainViewModel.cs ? ??????? ?????? ??????????: ??????? ??????, ???????? ????????, ?????????? ??????????, ??????? ? ?????.</w:t>
+      </w:r>
+    </w:p>
+    <w:p>
+      <w:pPr>
+        <w:pStyle w:val="ListBullet"/>
+        <w:spacing w:after="60"/>
+      </w:pPr>
+      <w:r>
+        <w:t>HttpMonitorApp/Services/HttpMonitorServer.cs ? ????????? HTTP-?????? ?? HttpListener.</w:t>
+      </w:r>
+    </w:p>
+    <w:p>
+      <w:pPr>
+        <w:pStyle w:val="ListBullet"/>
+        <w:spacing w:after="60"/>
+      </w:pPr>
+      <w:r>
+        <w:t>HttpMonitorApp/Services/ClientRequestService.cs ? ???????? ????????? HTTP-???????? ????? HttpClient.</w:t>
+      </w:r>
+    </w:p>
+    <w:p>
+      <w:pPr>
+        <w:pStyle w:val="ListBullet"/>
+        <w:spacing w:after="60"/>
+      </w:pPr>
+      <w:r>
+        <w:t>HttpMonitorApp/Services/RequestMonitorService.cs ? ???????? ?????, ?????? ? ????, ?????? ?????????? ? ????? ???????.</w:t>
+      </w:r>
+    </w:p>
+    <w:p>
+      <w:pPr>
+        <w:pStyle w:val="ListBullet"/>
+        <w:spacing w:after="60"/>
+      </w:pPr>
+      <w:r>
+        <w:t>HttpMonitorApp/Models ? ??????? ?????? ?????? ??? ?????, ??????????, ???????, ????????? ? ??????????? ????????.</w:t>
+      </w:r>
+    </w:p>
+    <w:p>
+      <w:pPr>
+        <w:pStyle w:val="ListBullet"/>
+        <w:spacing w:after="60"/>
+      </w:pPr>
+      <w:r>
+        <w:t>HttpMonitorApp/Helpers/AsyncRelayCommand.cs ? ????????????? ??????????? ??????? ??? ?????? WPF.</w:t>
+      </w:r>
+    </w:p>
+    <w:p>
+      <w:pPr>
+        <w:pStyle w:val="Heading2"/>
+      </w:pPr>
+      <w:r>
+        <w:rPr>
+          <w:rFonts w:ascii="Times New Roman" w:hAnsi="Times New Roman" w:eastAsia="Times New Roman"/>
+        </w:rPr>
+        <w:t>??????? ???????? ???? ? ??????????</w:t>
+      </w:r>
+    </w:p>
+    <w:p>
+      <w:pPr>
+        <w:spacing w:after="120"/>
+        <w:ind w:firstLine="360"/>
+      </w:pPr>
+      <w:r>
+        <w:t>MainWindow() ??????? ??????? ????, ?????????????? ?????????? XAML, ??????? ?????? MainViewModel ? ????????? ??? ? DataContext. ????????? ????? ???????? ?????????? ???????? ?????? ????? ???????? Binding.</w:t>
+      </w:r>
+    </w:p>
+    <w:p>
+      <w:pPr>
+        <w:spacing w:after="120"/>
+        <w:ind w:firstLine="360"/>
+      </w:pPr>
+      <w:r>
+        <w:t>OnClosing(...) ?????????? ??? ???????? ????. ????? ???????? ??????????? ????????, ?????????? ???????? DisposeAsync() ? ?????? ?????????????, ????????????? ?????? ? ?????? ????? ????? ????????? ??????????. ??? ?????, ????? ???? ??????????? ?????????.</w:t>
+      </w:r>
+    </w:p>
+    <w:p>
+      <w:pPr>
+        <w:spacing w:after="120"/>
+        <w:ind w:firstLine="360"/>
+      </w:pPr>
+      <w:r>
+        <w:t>????????: ????????? ??????????, ?????? ???????????, ????? ??????? ????. ????? ???????? ???? ?????? ????????????, ? ????????? ?????? ?????????? ?????? ????? ??????? ?????????? ?????? ?? ??? ?? ?????.</w:t>
+      </w:r>
+    </w:p>
+    <w:p>
+      <w:pPr>
+        <w:pStyle w:val="Heading2"/>
+      </w:pPr>
+      <w:r>
+        <w:rPr>
+          <w:rFonts w:ascii="Times New Roman" w:hAnsi="Times New Roman" w:eastAsia="Times New Roman"/>
+        </w:rPr>
+        <w:t>MainViewModel: ???????? ? ???????</w:t>
+      </w:r>
+    </w:p>
+    <w:p>
+      <w:pPr>
+        <w:spacing w:after="120"/>
+        <w:ind w:firstLine="360"/>
+      </w:pPr>
+      <w:r>
+        <w:t>MainViewModel() ??????? ?????? ???????????, HTTP-?????? ? HTTP-??????, ????????? ?????? ???????, ???????? ? ???????? ???????, ??????? ??????? ??????, ????????????? ?? ??????? ?????? ???? ? ????????? ?????? ?????????? ?????? ??????????.</w:t>
+      </w:r>
+    </w:p>
+    <w:p>
+      <w:pPr>
+        <w:pStyle w:val="ListBullet"/>
+        <w:spacing w:after="60"/>
+      </w:pPr>
+      <w:r>
+        <w:t>ServerPort ? ???? ?????????? ???????. ?? ????????? ???????????? 8080.</w:t>
+      </w:r>
+    </w:p>
+    <w:p>
+      <w:pPr>
+        <w:pStyle w:val="ListBullet"/>
+        <w:spacing w:after="60"/>
+      </w:pPr>
+      <w:r>
+        <w:t>ClientUrl ? ?????, ?? ??????? ?????????? ?????? ?????????? ??????.</w:t>
+      </w:r>
+    </w:p>
+    <w:p>
+      <w:pPr>
+        <w:pStyle w:val="ListBullet"/>
+        <w:spacing w:after="60"/>
+      </w:pPr>
+      <w:r>
+        <w:t>SelectedHttpMethod ? ????????? ????? ???????: GET ??? POST.</w:t>
+      </w:r>
+    </w:p>
+    <w:p>
+      <w:pPr>
+        <w:pStyle w:val="ListBullet"/>
+        <w:spacing w:after="60"/>
+      </w:pPr>
+      <w:r>
+        <w:t>RequestBody ? JSON-???? POST-???????.</w:t>
+      </w:r>
+    </w:p>
+    <w:p>
+      <w:pPr>
+        <w:pStyle w:val="ListBullet"/>
+        <w:spacing w:after="60"/>
+      </w:pPr>
+      <w:r>
+        <w:t>ResponseBody ? ????? ??????, ??????? ???????????? ? ??????????.</w:t>
+      </w:r>
+    </w:p>
+    <w:p>
+      <w:pPr>
+        <w:pStyle w:val="ListBullet"/>
+        <w:spacing w:after="60"/>
+      </w:pPr>
+      <w:r>
+        <w:t>LogsText ? ????????? ????????????? ??????????????? ?????.</w:t>
+      </w:r>
+    </w:p>
+    <w:p>
+      <w:pPr>
+        <w:pStyle w:val="ListBullet"/>
+        <w:spacing w:after="60"/>
+      </w:pPr>
+      <w:r>
+        <w:t>SelectedLogMethodFilter ? ?????? ????? ?? ??????: ???, GET, POST.</w:t>
+      </w:r>
+    </w:p>
+    <w:p>
+      <w:pPr>
+        <w:pStyle w:val="ListBullet"/>
+        <w:spacing w:after="60"/>
+      </w:pPr>
+      <w:r>
+        <w:t>SelectedStatusFilter ? ?????? ????? ?? ????????? ???????: ???, 2xx, 4xx, 5xx, ??????.</w:t>
+      </w:r>
+    </w:p>
+    <w:p>
+      <w:pPr>
+        <w:pStyle w:val="ListBullet"/>
+        <w:spacing w:after="60"/>
+      </w:pPr>
+      <w:r>
+        <w:t>SelectedGranularity ? ?????? ??????? ????????: ?????? ??? ????.</w:t>
+      </w:r>
+    </w:p>
+    <w:p>
+      <w:pPr>
+        <w:pStyle w:val="ListBullet"/>
+        <w:spacing w:after="60"/>
+      </w:pPr>
+      <w:r>
+        <w:t>Statistics ? ??????? ??????? ??????: ????? ??????, ????? ????????, ??????? ????? ????????? ? ????? ??????????? ?????????.</w:t>
+      </w:r>
+    </w:p>
+    <w:p>
+      <w:pPr>
+        <w:pStyle w:val="ListBullet"/>
+        <w:spacing w:after="60"/>
+      </w:pPr>
+      <w:r>
+        <w:t>LoadChart ? ????? ???????? ??? ??????? ????????.</w:t>
+      </w:r>
+    </w:p>
+    <w:p>
+      <w:pPr>
+        <w:spacing w:after="120"/>
+        <w:ind w:firstLine="360"/>
+      </w:pPr>
+      <w:r>
+        <w:t>StartServerCommand ????????? ????????? ??????. ?????? ??????? ?????? ????? ?????? ??????????. StopServerCommand ????????????? ?????? ? ??????? ?????? ??? ?????????? ???????. SendRequestCommand ?????????? HTTP-?????? ?? ?????????? ?????.</w:t>
+      </w:r>
+    </w:p>
+    <w:p>
+      <w:pPr>
+        <w:pStyle w:val="Heading2"/>
+      </w:pPr>
+      <w:r>
+        <w:rPr>
+          <w:rFonts w:ascii="Times New Roman" w:hAnsi="Times New Roman" w:eastAsia="Times New Roman"/>
+        </w:rPr>
+        <w:t>?????? MainViewModel</w:t>
+      </w:r>
+    </w:p>
+    <w:p>
+      <w:pPr>
+        <w:spacing w:after="120"/>
+        <w:ind w:firstLine="360"/>
+      </w:pPr>
+      <w:r>
+        <w:t>DisposeAsync() ????????????? ?????? ??????????, ???????????? ?? ??????? LogRecorded ? ???????? StopAsync() ? ???????. ????? ????? ??? ??????????? ?????????? ?????? ??????????.</w:t>
+      </w:r>
+    </w:p>
+    <w:p>
+      <w:pPr>
+        <w:spacing w:after="120"/>
+        <w:ind w:firstLine="360"/>
+      </w:pPr>
+      <w:r>
+        <w:t>StartServerAsync() ????????? ???????????? ?????: ???????? ?????? ???? ?????? ?? 1 ?? 65535. ???? ???? ?????? ???????, ? ?????? ????????? ????????? ?? ??????. ???? ???? ??????????, ??????????? HttpMonitorServer, ??????????? ????????? ??????? ? ??????????.</w:t>
+      </w:r>
+    </w:p>
+    <w:p>
+      <w:pPr>
+        <w:spacing w:after="120"/>
+        <w:ind w:firstLine="360"/>
+      </w:pPr>
+      <w:r>
+        <w:t>StopServerAsync() ???????? ????????? ???????, ????????? ????????? ? ????????? ????????????, ????????? ????????? ??????? ? ??????????.</w:t>
+      </w:r>
+    </w:p>
+    <w:p>
+      <w:pPr>
+        <w:spacing w:after="120"/>
+        <w:ind w:firstLine="360"/>
+      </w:pPr>
+      <w:r>
+        <w:t>SendRequestAsync() ?????????, ??? URL ?? ??????, ?????????????? ???? ??????? ??? POST, ???????? ClientRequestService.SendAsync(), ????? ????????? ????? ??????: ??????, ????????? ?????? ? ???? ??????.</w:t>
+      </w:r>
+    </w:p>
+    <w:p>
+      <w:pPr>
+        <w:spacing w:after="120"/>
+        <w:ind w:firstLine="360"/>
+      </w:pPr>
+      <w:r>
+        <w:t>OnLogRecorded(LogEntry entry) ?????????? ????? ?????? ?????? ????. ????? ????????????? ? UI-????? ????? Dispatcher ? ????????? ???? ? ??????????.</w:t>
+      </w:r>
+    </w:p>
+    <w:p>
+      <w:pPr>
+        <w:spacing w:after="120"/>
+        <w:ind w:firstLine="360"/>
+      </w:pPr>
+      <w:r>
+        <w:t>RefreshDashboard() ???????? ?????? ?????????? ?? RequestMonitorService, ??????? ? ?????? ????????? ??????? ???????????: ????? ??????, ????? ????? ???????? ????????, GET, POST, ??????? ????? ????????? ? ????? ??????????? ?????????.</w:t>
+      </w:r>
+    </w:p>
+    <w:p>
+      <w:pPr>
+        <w:spacing w:after="120"/>
+        <w:ind w:firstLine="360"/>
+      </w:pPr>
+      <w:r>
+        <w:t>RefreshChart() ???????? ????? ???????? ?? ?????? ??? ????, ????????? ???????????? ???????? ? ?????? ??????? ???????. ???? ??? ???????? ???????? ???????? ??????????? ??????, ????? ?????? ???????? ?????????.</w:t>
+      </w:r>
+    </w:p>
+    <w:p>
+      <w:pPr>
+        <w:spacing w:after="120"/>
+        <w:ind w:firstLine="360"/>
+      </w:pPr>
+      <w:r>
+        <w:t>RefreshLogsText() ???????? ????, ????????? ??????? ?? ?????? ? ???????, ????? ????????? ????????? ?????: ????, ??????????? IN/OUT, ?????, URL, ??????, ?????, ?????????, ???? ???????, ????????? ?????? ? ???? ??????.</w:t>
+      </w:r>
+    </w:p>
+    <w:p>
+      <w:pPr>
+        <w:pStyle w:val="Heading2"/>
+      </w:pPr>
+      <w:r>
+        <w:rPr>
+          <w:rFonts w:ascii="Times New Roman" w:hAnsi="Times New Roman" w:eastAsia="Times New Roman"/>
+        </w:rPr>
+        <w:t>HttpMonitorServer: ????????? ??????</w:t>
+      </w:r>
+    </w:p>
+    <w:p>
+      <w:pPr>
+        <w:spacing w:after="120"/>
+        <w:ind w:firstLine="360"/>
+      </w:pPr>
+      <w:r>
+        <w:t>HttpMonitorServer ?????? HttpListener, CancellationTokenSource, ?????????? ??????? ?????? ? ConcurrentDictionary ? ??????????? POST-???????????. ConcurrentDictionary ???????????? ??? ??????????? ??????? ? ?????????? ??? ???????????? ????????? ????????.</w:t>
+      </w:r>
+    </w:p>
+    <w:p>
+      <w:pPr>
+        <w:spacing w:after="120"/>
+        <w:ind w:firstLine="360"/>
+      </w:pPr>
+      <w:r>
+        <w:t>StartAsync(int port) ??????? HttpListener, ????????? ??????? http://localhost:{port}/, ????????? ?????????????, ????????? ??????? ????, ????????? ?????????? ? ??????? ???? AcceptLoopAsync(). ???? ?????? ??? ????????, ????? ?????? ?? ??????.</w:t>
+      </w:r>
+    </w:p>
+    <w:p>
+      <w:pPr>
+        <w:spacing w:after="120"/>
+        <w:ind w:firstLine="360"/>
+      </w:pPr>
+      <w:r>
+        <w:t>StopAsync() ???????? ????? ?????????, ????????????? ? ????????? listener, ?????????? ??????? ???? ? ????????????? ??????????. ????? ??????????? ??????? ????.</w:t>
+      </w:r>
+    </w:p>
+    <w:p>
+      <w:pPr>
+        <w:spacing w:after="120"/>
+        <w:ind w:firstLine="360"/>
+      </w:pPr>
+      <w:r>
+        <w:t>AcceptLoopAsync(...) ????????? ??????? ???????? HTTP-??????? ????? GetContextAsync(). ?????? ?????????? ?????? ?????????? ? HandleRequestAsync() ? ????????? ??????? ??????, ????? ?????? ??? ????????? ????????? ???????.</w:t>
+      </w:r>
+    </w:p>
+    <w:p>
+      <w:pPr>
+        <w:spacing w:after="120"/>
+        <w:ind w:firstLine="360"/>
+      </w:pPr>
+      <w:r>
+        <w:t>HandleRequestAsync(HttpListenerContext context) ? ???????? ?????????? ???????? ????????. ?? ?????? ???? ???????, ????????? ??????????, ???????? ?????? ?? HTTP-??????, ????????? JSON-?????, ?????????? ??? ??????? ? ?????????? ????????? LogEntry.</w:t>
+      </w:r>
+    </w:p>
+    <w:p>
+      <w:pPr>
+        <w:pStyle w:val="ListBullet"/>
+        <w:spacing w:after="60"/>
+      </w:pPr>
+      <w:r>
+        <w:t>GET ?????????? JSON ?? ???????? ???????: ??? ???????, ????, ????? ??????, ?????????? ???????? ????????, GET, POST, ??????? ????? ????????? ? ????? ??????????? ?????????.</w:t>
+      </w:r>
+    </w:p>
+    <w:p>
+      <w:pPr>
+        <w:pStyle w:val="ListBullet"/>
+        <w:spacing w:after="60"/>
+      </w:pPr>
+      <w:r>
+        <w:t>POST ??????? JSON ? ????? message. ???? ???? ??????????? ??? ??????, ???????????? ?????? 400. ???? ???? ?????????, ????????? ??????????? ? ????? Guid ? ???????????? ?????? 201.</w:t>
+      </w:r>
+    </w:p>
+    <w:p>
+      <w:pPr>
+        <w:pStyle w:val="ListBullet"/>
+        <w:spacing w:after="60"/>
+      </w:pPr>
+      <w:r>
+        <w:t>?????? ?????? ?????????? ?????? 405, ?????? ??? ?????? ???????????? ?????? GET ? POST.</w:t>
+      </w:r>
+    </w:p>
+    <w:p>
+      <w:pPr>
+        <w:pStyle w:val="ListBullet"/>
+        <w:spacing w:after="60"/>
+      </w:pPr>
+      <w:r>
+        <w:t>???????????? JSON ?????????????? ??? ?????? 400. ?????????????? ?????? ?????????? 500.</w:t>
+      </w:r>
+    </w:p>
+    <w:p>
+      <w:pPr>
+        <w:spacing w:after="120"/>
+        <w:ind w:firstLine="360"/>
+      </w:pPr>
+      <w:r>
+        <w:t>BuildStatusResponse() ???????? MonitoringSnapshot ? ??????????? ??? ? JSON ??? GET-??????.</w:t>
+      </w:r>
+    </w:p>
+    <w:p>
+      <w:pPr>
+        <w:spacing w:after="120"/>
+        <w:ind w:firstLine="360"/>
+      </w:pPr>
+      <w:r>
+        <w:t>ReadBodyAsync(HttpListenerRequest request) ?????? ???? ????????? ???????. ???? ???? ???, ?????????? ?????? ??????. ??? ??????????? ????????? ?????????? UTF-8.</w:t>
+      </w:r>
+    </w:p>
+    <w:p>
+      <w:pPr>
+        <w:spacing w:after="120"/>
+        <w:ind w:firstLine="360"/>
+      </w:pPr>
+      <w:r>
+        <w:t>FormatHeaders(NameValueCollection headers) ??????????? ????????? ????????? ??????? ? ????????????? ????? ??? ?????.</w:t>
+      </w:r>
+    </w:p>
+    <w:p>
+      <w:pPr>
+        <w:pStyle w:val="Heading2"/>
+      </w:pPr>
+      <w:r>
+        <w:rPr>
+          <w:rFonts w:ascii="Times New Roman" w:hAnsi="Times New Roman" w:eastAsia="Times New Roman"/>
+        </w:rPr>
+        <w:t>ClientRequestService: ?????????? HTTP-??????</w:t>
+      </w:r>
+    </w:p>
+    <w:p>
+      <w:pPr>
+        <w:spacing w:after="120"/>
+        <w:ind w:firstLine="360"/>
+      </w:pPr>
+      <w:r>
+        <w:t>ClientRequestService ?????????? ????????? ??????? ?? ?????????? ????????? ? ?????????? ????????? ? ????? ?????? ???????????.</w:t>
+      </w:r>
+    </w:p>
+    <w:p>
+      <w:pPr>
+        <w:spacing w:after="120"/>
+        <w:ind w:firstLine="360"/>
+      </w:pPr>
+      <w:r>
+        <w:t>SendAsync(string url, string method, string? requestBody) ??????? HttpRequestMessage. ??? POST ????????? JSON-???? ? ?????????? UTF-8 ? content-type application/json. ????? ?????????? ?????? ????? HttpClient, ?????? ??????, ???? ? ????????? ??????. ? ????? finally ?????? ?????????? LogEntry, ???? ???? ?????? ?????????? ???????.</w:t>
+      </w:r>
+    </w:p>
+    <w:p>
+      <w:pPr>
+        <w:spacing w:after="120"/>
+        <w:ind w:firstLine="360"/>
+      </w:pPr>
+      <w:r>
+        <w:t>BuildRequestHeaders(HttpRequestMessage request) ????????? ????? ?????????? ?????????? ???????, ??????? Request-Uri ? ????????? Content, ???? ???? ????.</w:t>
+      </w:r>
+    </w:p>
+    <w:p>
+      <w:pPr>
+        <w:spacing w:after="120"/>
+        <w:ind w:firstLine="360"/>
+      </w:pPr>
+      <w:r>
+        <w:t>FormatHeaders(...) ??????????? ????????? HTTP-?????????? ?????? ? ???????? ????????????? ?????.</w:t>
+      </w:r>
+    </w:p>
+    <w:p>
+      <w:pPr>
+        <w:pStyle w:val="Heading2"/>
+      </w:pPr>
+      <w:r>
+        <w:rPr>
+          <w:rFonts w:ascii="Times New Roman" w:hAnsi="Times New Roman" w:eastAsia="Times New Roman"/>
+        </w:rPr>
+        <w:t>RequestMonitorService: ??????????? ? ?????????</w:t>
+      </w:r>
+    </w:p>
+    <w:p>
+      <w:pPr>
+        <w:spacing w:after="120"/>
+        <w:ind w:firstLine="360"/>
+      </w:pPr>
+      <w:r>
+        <w:t>RequestMonitorService ?????? ?????? LogEntry ? ?????? ? ???? ? ????? logs.txt. ??? ?????????????????? ???????????? lock ?? ??????? _syncRoot.</w:t>
+      </w:r>
+    </w:p>
+    <w:p>
+      <w:pPr>
+        <w:spacing w:after="120"/>
+        <w:ind w:firstLine="360"/>
+      </w:pPr>
+      <w:r>
+        <w:t>Record(LogEntry entry) ????????? ?????? ? ??????, ?????????? ?????????? ??????????????? ????? ? ???? logs.txt ? ???????? ??????? LogRecorded, ????? ????????? ?????????.</w:t>
+      </w:r>
+    </w:p>
+    <w:p>
+      <w:pPr>
+        <w:spacing w:after="120"/>
+        <w:ind w:firstLine="360"/>
+      </w:pPr>
+      <w:r>
+        <w:t>GetLogs() ?????????? ????? ?????, ??????????????? ?? ????? ? ??????. ????? ?????, ????? ????????? ?? ??????? ???????? ? ?????????? ???????.</w:t>
+      </w:r>
+    </w:p>
+    <w:p>
+      <w:pPr>
+        <w:spacing w:after="120"/>
+        <w:ind w:firstLine="360"/>
+      </w:pPr>
+      <w:r>
+        <w:t>CreateSnapshot(TimeSpan uptime, int storedMessages) ????? ?????? ???????? ??????? ? ??????? ????? ?????, ?????????? GET ? POST, ??????? ????? ?????????, ????? ??????????? ????????? ? ????? ?????? ???????.</w:t>
+      </w:r>
+    </w:p>
+    <w:p>
+      <w:pPr>
+        <w:spacing w:after="120"/>
+        <w:ind w:firstLine="360"/>
+      </w:pPr>
+      <w:r>
+        <w:t>BuildLoadPoints(LoadGranularity granularity) ?????? ????? ??????? ????????. ??? ????? ??????? ????????? 10 ?????, ??? ????? ? ????????? 12 ?????. ???? ???????????? ?? ?????????? ???????.</w:t>
+      </w:r>
+    </w:p>
+    <w:p>
+      <w:pPr>
+        <w:spacing w:after="120"/>
+        <w:ind w:firstLine="360"/>
+      </w:pPr>
+      <w:r>
+        <w:t>Truncate(DateTime timestamp, LoadGranularity granularity) ??????????? ??????? ??? ???????? ??????????? ??? ?????? ? ??????? ??? ??????? ???????????.</w:t>
+      </w:r>
+    </w:p>
+    <w:p>
+      <w:pPr>
+        <w:spacing w:after="120"/>
+        <w:ind w:firstLine="360"/>
+      </w:pPr>
+      <w:r>
+        <w:t>FormatLogEntry(LogEntry entry) ????????? ????? ??? ????? ?????: ?????, ???????????, ?????, URL, ??????, ????????????, ?????????, ???? ???????, ????????? ?????? ? ???? ??????.</w:t>
+      </w:r>
+    </w:p>
+    <w:p>
+      <w:pPr>
+        <w:pStyle w:val="Heading2"/>
+      </w:pPr>
+      <w:r>
+        <w:rPr>
+          <w:rFonts w:ascii="Times New Roman" w:hAnsi="Times New Roman" w:eastAsia="Times New Roman"/>
+        </w:rPr>
+        <w:t>?????? ??????</w:t>
+      </w:r>
+    </w:p>
+    <w:p>
+      <w:pPr>
+        <w:pStyle w:val="ListBullet"/>
+        <w:spacing w:after="60"/>
+      </w:pPr>
+      <w:r>
+        <w:t>LogEntry ? ?????? ?????? ?????? ??????? ??? ??????. ???????? ?????, ???????????, ?????, URL, ?????????, ???? ???????, ??????, ???? ??????, ????????? ?????? ? ????????????. ???????? StatusDisplay ?????????? ??? ??? ????????, ? StatusCategory ??????? ??? ? 2xx, 3xx, 4xx, 5xx ??? ????????.</w:t>
+      </w:r>
+    </w:p>
+    <w:p>
+      <w:pPr>
+        <w:pStyle w:val="ListBullet"/>
+        <w:spacing w:after="60"/>
+      </w:pPr>
+      <w:r>
+        <w:t>LogDirection ? ??????????? ????: ???????? ?????? ??????? ??? ????????? ?????? ???????.</w:t>
+      </w:r>
+    </w:p>
+    <w:p>
+      <w:pPr>
+        <w:pStyle w:val="ListBullet"/>
+        <w:spacing w:after="60"/>
+      </w:pPr>
+      <w:r>
+        <w:t>MonitoringSnapshot ? ?????????????? ?????????? ??? ?????? ???????????.</w:t>
+      </w:r>
+    </w:p>
+    <w:p>
+      <w:pPr>
+        <w:pStyle w:val="ListBullet"/>
+        <w:spacing w:after="60"/>
+      </w:pPr>
+      <w:r>
+        <w:t>MetricRow ? ?????? ??????? ??????????: ???????? ?????????? ? ????????.</w:t>
+      </w:r>
+    </w:p>
+    <w:p>
+      <w:pPr>
+        <w:pStyle w:val="ListBullet"/>
+        <w:spacing w:after="60"/>
+      </w:pPr>
+      <w:r>
+        <w:t>LoadPoint ? ????? ???????? ?? ?????????????? ? ?????????? ???????.</w:t>
+      </w:r>
+    </w:p>
+    <w:p>
+      <w:pPr>
+        <w:pStyle w:val="ListBullet"/>
+        <w:spacing w:after="60"/>
+      </w:pPr>
+      <w:r>
+        <w:t>LoadChartBar ? ??????? ?????? ??????? ???????: ???????, ?????????? ? ??????.</w:t>
+      </w:r>
+    </w:p>
+    <w:p>
+      <w:pPr>
+        <w:pStyle w:val="ListBullet"/>
+        <w:spacing w:after="60"/>
+      </w:pPr>
+      <w:r>
+        <w:t>IncomingMessagePayload ? ?????? JSON ??? POST-??????? ?? ????????? ??????, ???????? ???? Message.</w:t>
+      </w:r>
+    </w:p>
+    <w:p>
+      <w:pPr>
+        <w:pStyle w:val="ListBullet"/>
+        <w:spacing w:after="60"/>
+      </w:pPr>
+      <w:r>
+        <w:t>MessageRecord ? ??????????? ???????? ????????? ? Id, ??????? ? ???????? ?????????.</w:t>
+      </w:r>
+    </w:p>
+    <w:p>
+      <w:pPr>
+        <w:pStyle w:val="ListBullet"/>
+        <w:spacing w:after="60"/>
+      </w:pPr>
+      <w:r>
+        <w:t>ClientRequestResult ? ????????? ?????????? ??????? ???????: ??????, ???? ??????, ????????? ? ??????? ??????.</w:t>
+      </w:r>
+    </w:p>
+    <w:p>
+      <w:pPr>
+        <w:pStyle w:val="ListBullet"/>
+        <w:spacing w:after="60"/>
+      </w:pPr>
+      <w:r>
+        <w:t>LoadGranularity ? ???????????? ??????? ???????: Minute ??? Hour.</w:t>
+      </w:r>
+    </w:p>
+    <w:p>
+      <w:pPr>
+        <w:pStyle w:val="Heading2"/>
+      </w:pPr>
+      <w:r>
+        <w:rPr>
+          <w:rFonts w:ascii="Times New Roman" w:hAnsi="Times New Roman" w:eastAsia="Times New Roman"/>
+        </w:rPr>
+        <w:t>AsyncRelayCommand ? ObservableObject</w:t>
+      </w:r>
+    </w:p>
+    <w:p>
+      <w:pPr>
+        <w:spacing w:after="120"/>
+        <w:ind w:firstLine="360"/>
+      </w:pPr>
+      <w:r>
+        <w:t>AsyncRelayCommand ????????? ICommand ??? ??????????? ???????? ? WPF. CanExecute() ????????? ????????? ?????? ???????, ???? ?????????? ?????? ??? ???????????. Execute() ?????????? ???? ??????????, ???????? ??????????? ??????? ? ????? ??????? ????. RaiseCanExecuteChanged() ???????? ??????????, ??? ??????????? ?????? ??????????.</w:t>
+      </w:r>
+    </w:p>
+    <w:p>
+      <w:pPr>
+        <w:spacing w:after="120"/>
+        <w:ind w:firstLine="360"/>
+      </w:pPr>
+      <w:r>
+        <w:t>ObservableObject ????????? INotifyPropertyChanged. SetProperty() ?????????? ?????? ? ????? ????????, ????????? ???? ? ???????? OnPropertyChanged(). ????????? ????? ????????? ????????????? ??????????? ??? ????????? ??????? ViewModel.</w:t>
+      </w:r>
+    </w:p>
+    <w:p>
+      <w:pPr>
+        <w:pStyle w:val="Heading2"/>
+      </w:pPr>
+      <w:r>
+        <w:rPr>
+          <w:rFonts w:ascii="Times New Roman" w:hAnsi="Times New Roman" w:eastAsia="Times New Roman"/>
+        </w:rPr>
+        <w:t>??? ????????? ????????? ???????</w:t>
+      </w:r>
+    </w:p>
+    <w:p>
+      <w:pPr>
+        <w:pStyle w:val="ListNumber"/>
+        <w:spacing w:after="60"/>
+      </w:pPr>
+      <w:r>
+        <w:t>??????? ??????? kr3.sln ? Visual Studio ??? ????????? ?????? HttpMonitorApp ????? dotnet run ?? Windows ? ?????????? WPF.</w:t>
+      </w:r>
+    </w:p>
+    <w:p>
+      <w:pPr>
+        <w:pStyle w:val="ListNumber"/>
+        <w:spacing w:after="60"/>
+      </w:pPr>
+      <w:r>
+        <w:t>? ???? ????? ???????? 8080 ? ?????? ???????????. ????????? ?????????: ????????? ??????? ????????? ?? ????????? ?? ????? 8080?, ? ??????????? ???????? ????? http://localhost:8080/.</w:t>
+      </w:r>
+    </w:p>
+    <w:p>
+      <w:pPr>
+        <w:pStyle w:val="ListNumber"/>
+        <w:spacing w:after="60"/>
+      </w:pPr>
+      <w:r>
+        <w:t>????????? GET ?????????? ???????: ? ?????????? URL ??????? http://localhost:8080/, ??????? GET ? ?????? ?????????? ???????. ????????? ?????????: ? ?????? ????? JSON ?? ??????????? ???????, ? ????? ???????? ?????? OUT GET ? IN GET, ??????? GET ??????????.</w:t>
+      </w:r>
+    </w:p>
+    <w:p>
+      <w:pPr>
+        <w:pStyle w:val="ListNumber"/>
+        <w:spacing w:after="60"/>
+      </w:pPr>
+      <w:r>
+        <w:t>????????? POST ?????????? ???????: ? URL ??????? http://localhost:8080/, ??????? POST, ? ???? ?????? {"message":"???????? ?????????"} ? ?????????. ????????? ?????????: ?????? 201, ? ?????? ????? id, receivedAt ? message, ??????? POST ? ????? ??????????? ????????? ??????????.</w:t>
+      </w:r>
+    </w:p>
+    <w:p>
+      <w:pPr>
+        <w:pStyle w:val="ListNumber"/>
+        <w:spacing w:after="60"/>
+      </w:pPr>
+      <w:r>
+        <w:t>????????? ?????? 400: ??????? POST ? ????????? ???? {"text":"??? message"}. ????????? ?????????: ?????? ?????? 400, ? ????? ?????? ??????? ? ????????? 4xx.</w:t>
+      </w:r>
+    </w:p>
+    <w:p>
+      <w:pPr>
+        <w:pStyle w:val="ListNumber"/>
+        <w:spacing w:after="60"/>
+      </w:pPr>
+      <w:r>
+        <w:t>????????? ?????? ????????????? JSON: ????????? POST ? ????? {message:123}. ????????? ?????????: ?????? 400 ? ????????? ? ???????????? JSON.</w:t>
+      </w:r>
+    </w:p>
+    <w:p>
+      <w:pPr>
+        <w:pStyle w:val="ListNumber"/>
+        <w:spacing w:after="60"/>
+      </w:pPr>
+      <w:r>
+        <w:t>????????? ?????? ????? ?? ??????: ??????? GET, ????? POST. ????????? ?????????: ? ????????? ???? ????? ???????? ?????? ?????? ?????????? ??????.</w:t>
+      </w:r>
+    </w:p>
+    <w:p>
+      <w:pPr>
+        <w:pStyle w:val="ListNumber"/>
+        <w:spacing w:after="60"/>
+      </w:pPr>
+      <w:r>
+        <w:t>????????? ?????? ????? ?? ???????: ??????? 2xx, ????? 4xx. ????????? ?????????: ???????????? ?????? ???????? ?????? ??? ?????????? ?????? ??????????????.</w:t>
+      </w:r>
+    </w:p>
+    <w:p>
+      <w:pPr>
+        <w:pStyle w:val="ListNumber"/>
+        <w:spacing w:after="60"/>
+      </w:pPr>
+      <w:r>
+        <w:t>????????? ?????? ????????: ????? ?????????? GET/POST ???????? ??????? ???????? ????????? ?????? ???????????. ???????????? ????????/?????? ?????? ?????? ??????? ??????????.</w:t>
+      </w:r>
+    </w:p>
+    <w:p>
+      <w:pPr>
+        <w:pStyle w:val="ListNumber"/>
+        <w:spacing w:after="60"/>
+      </w:pPr>
+      <w:r>
+        <w:t>????????? ???? ?????: ?????????? ???? ? ????? ????? ??????, ??????? logs.txt ? ?????????, ??? ??? ???? ???????, ?????????, ????, ?????? ? ??????????? ???????.</w:t>
+      </w:r>
+    </w:p>
+    <w:p>
+      <w:pPr>
+        <w:pStyle w:val="ListNumber"/>
+        <w:spacing w:after="60"/>
+      </w:pPr>
+      <w:r>
+        <w:t>????????? ????????? ???????: ?????? ????????????, ????? ????????? GET ?? http://localhost:8080/. ????????? ?????????: ?????? ?????????? ???????, ? ????????? ??????? ????? ????????????.</w:t>
+      </w:r>
+    </w:p>
+    <w:p>
+      <w:pPr>
+        <w:pStyle w:val="ListNumber"/>
+        <w:spacing w:after="60"/>
+      </w:pPr>
+      <w:r>
+        <w:t>????????? ????????? ?????: ?????? 0, 70000 ??? ????? ?????? ????? ? ?????? ???????????. ????????? ?????????: ?????? ?? ???????????, ?????????? ????????? ? ?????????? ????????? 1-65535.</w:t>
+      </w:r>
+    </w:p>
+    <w:p>
+      <w:pPr>
+        <w:pStyle w:val="Heading2"/>
+      </w:pPr>
+      <w:r>
+        <w:rPr>
+          <w:rFonts w:ascii="Times New Roman" w:hAnsi="Times New Roman" w:eastAsia="Times New Roman"/>
+        </w:rPr>
+        <w:t>???????? ????? ??????? ???????????</w:t>
+      </w:r>
+    </w:p>
+    <w:p>
+      <w:pPr>
+        <w:spacing w:after="120"/>
+        <w:ind w:firstLine="360"/>
+      </w:pPr>
+      <w:r>
+        <w:t>GET ????? ????????? ? ????????, ?????? http://localhost:8080/ ????? ??????? ???????. ?????? ???????????? JSON ?? ???????????.</w:t>
+      </w:r>
+    </w:p>
+    <w:p>
+      <w:pPr>
+        <w:spacing w:after="120"/>
+        <w:ind w:firstLine="360"/>
+      </w:pPr>
+      <w:r>
+        <w:t>POST ????? ????????? ????? PowerShell:</w:t>
+      </w:r>
+    </w:p>
+    <w:p>
+      <w:r>
+        <w:rPr>
+          <w:rFonts w:ascii="Consolas" w:hAnsi="Consolas" w:eastAsia="Consolas"/>
+        </w:rPr>
+        <w:t>Invoke-RestMethod -Uri http://localhost:8080/ -Method Post -ContentType "application/json; charset=utf-8" -Body {"message":"???????? ?? PowerShell"}</w:t>
+      </w:r>
+    </w:p>
+    <w:p>
+      <w:pPr>
+        <w:spacing w:after="120"/>
+        <w:ind w:firstLine="360"/>
+      </w:pPr>
+      <w:r>
+        <w:t>????????? ????????? PowerShell-???????: ?????? ? id, receivedAt ? message. ? ?????????? ?????? ?????????? ??????????, ?????? ? ????.</w:t>
+      </w:r>
+    </w:p>
+    <w:p>
+      <w:pPr>
+        <w:pStyle w:val="Heading2"/>
+      </w:pPr>
+      <w:r>
+        <w:rPr>
+          <w:rFonts w:ascii="Times New Roman" w:hAnsi="Times New Roman" w:eastAsia="Times New Roman"/>
+        </w:rPr>
+        <w:t>???????? ???????? ????????</w:t>
+      </w:r>
+    </w:p>
+    <w:p>
+      <w:pPr>
+        <w:pStyle w:val="ListBullet"/>
+        <w:spacing w:after="60"/>
+      </w:pPr>
+      <w:r>
+        <w:t>?????? ??????????? ? ??????????????? ??? ?????????.</w:t>
+      </w:r>
+    </w:p>
+    <w:p>
+      <w:pPr>
+        <w:pStyle w:val="ListBullet"/>
+        <w:spacing w:after="60"/>
+      </w:pPr>
+      <w:r>
+        <w:t>GET ?????????? ?????????? ??????? ? JSON.</w:t>
+      </w:r>
+    </w:p>
+    <w:p>
+      <w:pPr>
+        <w:pStyle w:val="ListBullet"/>
+        <w:spacing w:after="60"/>
+      </w:pPr>
+      <w:r>
+        <w:t>POST ? ????? message ????????? ????????? ? ?????????? ?????? 201.</w:t>
+      </w:r>
+    </w:p>
+    <w:p>
+      <w:pPr>
+        <w:pStyle w:val="ListBullet"/>
+        <w:spacing w:after="60"/>
+      </w:pPr>
+      <w:r>
+        <w:t>????????? POST-??????? ?????????? 400, ???????????????? ?????? ? 405.</w:t>
+      </w:r>
+    </w:p>
+    <w:p>
+      <w:pPr>
+        <w:pStyle w:val="ListBullet"/>
+        <w:spacing w:after="60"/>
+      </w:pPr>
+      <w:r>
+        <w:t>????????? ? ???????? ??????? ???????????? ? ????? ? ???????????? ? logs.txt.</w:t>
+      </w:r>
+    </w:p>
+    <w:p>
+      <w:pPr>
+        <w:pStyle w:val="ListBullet"/>
+        <w:spacing w:after="60"/>
+      </w:pPr>
+      <w:r>
+        <w:t>??????? ????? ????????? ?????? ???????????? ??????.</w:t>
+      </w:r>
+    </w:p>
+    <w:p>
+      <w:pPr>
+        <w:pStyle w:val="ListBullet"/>
+        <w:spacing w:after="60"/>
+      </w:pPr>
+      <w:r>
+        <w:t>?????????? ? ?????? ??????????? ????? ????? ????????.</w:t>
+      </w:r>
+    </w:p>
+    <w:p>
+      <w:pPr>
+        <w:pStyle w:val="ListBullet"/>
+        <w:spacing w:after="60"/>
+      </w:pPr>
+      <w:r>
+        <w:t>????????? ? ???? Word-????? ???????????? ?????????, ??? ??? ???????? ???????? ? ??????? .docx ? Unicode-???????.</w:t>
       </w:r>
     </w:p>
     <w:sectPr>
@@ -1742,7 +2726,7 @@
       <w:outlineLvl w:val="2"/>
     </w:pPr>
     <w:rPr>
-      <w:rFonts w:asciiTheme="majorHAnsi" w:eastAsiaTheme="majorEastAsia" w:hAnsiTheme="majorHAnsi" w:cstheme="majorBidi"/>
+      <w:rFonts w:asciiTheme="majorHAnsi" w:eastAsiaTheme="majorEastAsia" w:hAnsiTheme="majorHAnsi" w:cstheme="majorBidi" w:ascii="Times New Roman" w:hAnsi="Times New Roman" w:eastAsia="Times New Roman"/>
       <w:b/>
       <w:bCs/>
       <w:color w:val="4F81BD" w:themeColor="accent1"/>

</xml_diff>